<commit_message>
Ajuste de algunos campos y funcionalidades minimas, SaaS base establecido
</commit_message>
<xml_diff>
--- a/patron de capas/web/templates/Oficio de Justificacion_ Tecnologias de la Informacion.docx
+++ b/patron de capas/web/templates/Oficio de Justificacion_ Tecnologias de la Informacion.docx
@@ -171,7 +171,7 @@
           <w:sz w:val="24"/>
           <w:szCs w:val="24"/>
         </w:rPr>
-        <w:t>Tecnologías de la Información</w:t>
+        <w:t>{{carrera}}</w:t>
       </w:r>
     </w:p>
     <w:p>
@@ -365,7 +365,23 @@
           <w:sz w:val="24"/>
           <w:szCs w:val="24"/>
         </w:rPr>
-        <w:t xml:space="preserve"> de la Extensión, </w:t>
+        <w:t xml:space="preserve"> de la Extensión</w:t>
+      </w:r>
+      <w:r>
+        <w:rPr>
+          <w:rFonts w:cs="Arial"/>
+          <w:sz w:val="24"/>
+          <w:szCs w:val="24"/>
+        </w:rPr>
+        <w:t xml:space="preserve"> Chone</w:t>
+      </w:r>
+      <w:r>
+        <w:rPr>
+          <w:rFonts w:cs="Arial"/>
+          <w:sz w:val="24"/>
+          <w:szCs w:val="24"/>
+        </w:rPr>
+        <w:t xml:space="preserve">, </w:t>
       </w:r>
       <w:r>
         <w:rPr>
@@ -513,12 +529,12 @@
         <w:tblLook w:val="04A0" w:firstRow="1" w:lastRow="0" w:firstColumn="1" w:lastColumn="0" w:noHBand="0" w:noVBand="1"/>
       </w:tblPr>
       <w:tblGrid>
-        <w:gridCol w:w="1168"/>
-        <w:gridCol w:w="1606"/>
-        <w:gridCol w:w="1608"/>
-        <w:gridCol w:w="1608"/>
-        <w:gridCol w:w="915"/>
-        <w:gridCol w:w="1305"/>
+        <w:gridCol w:w="2197"/>
+        <w:gridCol w:w="1114"/>
+        <w:gridCol w:w="891"/>
+        <w:gridCol w:w="1131"/>
+        <w:gridCol w:w="914"/>
+        <w:gridCol w:w="1963"/>
       </w:tblGrid>
       <w:tr>
         <w:tc>

</xml_diff>